<commit_message>
Making app don't need limited
</commit_message>
<xml_diff>
--- a/ProjectReports/25-26 Project Final Report_ShuWang_S23153653.docx
+++ b/ProjectReports/25-26 Project Final Report_ShuWang_S23153653.docx
@@ -546,7 +546,6 @@
         </w:rPr>
         <w:t xml:space="preserve"> </w:t>
       </w:r>
-      <w:proofErr w:type="gramStart"/>
       <w:r>
         <w:rPr>
           <w:rFonts w:ascii="Arial" w:hAnsi="Arial" w:cs="Arial" w:hint="eastAsia"/>
@@ -554,9 +553,28 @@
           <w:szCs w:val="32"/>
           <w:lang w:eastAsia="zh-CN"/>
         </w:rPr>
-        <w:t>BSc(</w:t>
-      </w:r>
-      <w:proofErr w:type="gramEnd"/>
+        <w:t>BSc(Hons) Computer Gaming technology</w:t>
+      </w:r>
+    </w:p>
+    <w:p>
+      <w:pPr>
+        <w:rPr>
+          <w:rFonts w:ascii="Arial" w:hAnsi="Arial" w:cs="Arial"/>
+          <w:sz w:val="32"/>
+          <w:szCs w:val="32"/>
+          <w:lang w:eastAsia="zh-CN"/>
+        </w:rPr>
+      </w:pPr>
+      <w:r>
+        <w:rPr>
+          <w:rFonts w:ascii="Arial" w:hAnsi="Arial" w:cs="Arial"/>
+          <w:b/>
+          <w:bCs/>
+          <w:sz w:val="32"/>
+          <w:szCs w:val="32"/>
+        </w:rPr>
+        <w:t>Supervisor:</w:t>
+      </w:r>
       <w:r>
         <w:rPr>
           <w:rFonts w:ascii="Arial" w:hAnsi="Arial" w:cs="Arial" w:hint="eastAsia"/>
@@ -564,7 +582,7 @@
           <w:szCs w:val="32"/>
           <w:lang w:eastAsia="zh-CN"/>
         </w:rPr>
-        <w:t>Hons) Computer Gaming technology</w:t>
+        <w:t xml:space="preserve"> Richard Daves</w:t>
       </w:r>
     </w:p>
     <w:p>
@@ -584,7 +602,15 @@
           <w:sz w:val="32"/>
           <w:szCs w:val="32"/>
         </w:rPr>
-        <w:t>Supervisor:</w:t>
+        <w:t>Date:</w:t>
+      </w:r>
+      <w:r>
+        <w:rPr>
+          <w:rFonts w:ascii="Arial" w:hAnsi="Arial" w:cs="Arial"/>
+          <w:sz w:val="32"/>
+          <w:szCs w:val="32"/>
+        </w:rPr>
+        <w:t xml:space="preserve"> </w:t>
       </w:r>
       <w:r>
         <w:rPr>
@@ -593,43 +619,6 @@
           <w:szCs w:val="32"/>
           <w:lang w:eastAsia="zh-CN"/>
         </w:rPr>
-        <w:t xml:space="preserve"> Richard Daves</w:t>
-      </w:r>
-    </w:p>
-    <w:p>
-      <w:pPr>
-        <w:rPr>
-          <w:rFonts w:ascii="Arial" w:hAnsi="Arial" w:cs="Arial"/>
-          <w:sz w:val="32"/>
-          <w:szCs w:val="32"/>
-          <w:lang w:eastAsia="zh-CN"/>
-        </w:rPr>
-      </w:pPr>
-      <w:r>
-        <w:rPr>
-          <w:rFonts w:ascii="Arial" w:hAnsi="Arial" w:cs="Arial"/>
-          <w:b/>
-          <w:bCs/>
-          <w:sz w:val="32"/>
-          <w:szCs w:val="32"/>
-        </w:rPr>
-        <w:t>Date:</w:t>
-      </w:r>
-      <w:r>
-        <w:rPr>
-          <w:rFonts w:ascii="Arial" w:hAnsi="Arial" w:cs="Arial"/>
-          <w:sz w:val="32"/>
-          <w:szCs w:val="32"/>
-        </w:rPr>
-        <w:t xml:space="preserve"> </w:t>
-      </w:r>
-      <w:r>
-        <w:rPr>
-          <w:rFonts w:ascii="Arial" w:hAnsi="Arial" w:cs="Arial" w:hint="eastAsia"/>
-          <w:sz w:val="32"/>
-          <w:szCs w:val="32"/>
-          <w:lang w:eastAsia="zh-CN"/>
-        </w:rPr>
         <w:t>05/05/2026</w:t>
       </w:r>
     </w:p>
@@ -789,47 +778,7 @@
           <w:szCs w:val="22"/>
           <w:lang w:val="en" w:eastAsia="zh-CN"/>
         </w:rPr>
-        <w:t xml:space="preserve">This project employs a combined approach of developmental research and system prototyping, focusing on local offline speech recognition and building a system around mobile learning scenario. Initially, the project planned to combine speech recognition, tone analysis, and visual feedback mechanisms to achieve a more complete pronunciation learning experience. However, during actual development, the focus gradually shifted to the implementation and system integration verification of the offline speech recognition module. The system ultimately uses whisper.cpp as its core speech recognition engine, employs </w:t>
-      </w:r>
-      <w:proofErr w:type="spellStart"/>
-      <w:r>
-        <w:rPr>
-          <w:rFonts w:ascii="Arial" w:hAnsi="Arial" w:cs="Arial"/>
-          <w:sz w:val="22"/>
-          <w:szCs w:val="22"/>
-          <w:lang w:val="en" w:eastAsia="zh-CN"/>
-        </w:rPr>
-        <w:t>ggml</w:t>
-      </w:r>
-      <w:proofErr w:type="spellEnd"/>
-      <w:r>
-        <w:rPr>
-          <w:rFonts w:ascii="Arial" w:hAnsi="Arial" w:cs="Arial"/>
-          <w:sz w:val="22"/>
-          <w:szCs w:val="22"/>
-          <w:lang w:val="en" w:eastAsia="zh-CN"/>
-        </w:rPr>
-        <w:t xml:space="preserve"> format models for local loading and inference, and utilizes </w:t>
-      </w:r>
-      <w:proofErr w:type="spellStart"/>
-      <w:r>
-        <w:rPr>
-          <w:rFonts w:ascii="Arial" w:hAnsi="Arial" w:cs="Arial"/>
-          <w:sz w:val="22"/>
-          <w:szCs w:val="22"/>
-          <w:lang w:val="en" w:eastAsia="zh-CN"/>
-        </w:rPr>
-        <w:t>CMake</w:t>
-      </w:r>
-      <w:proofErr w:type="spellEnd"/>
-      <w:r>
-        <w:rPr>
-          <w:rFonts w:ascii="Arial" w:hAnsi="Arial" w:cs="Arial"/>
-          <w:sz w:val="22"/>
-          <w:szCs w:val="22"/>
-          <w:lang w:val="en" w:eastAsia="zh-CN"/>
-        </w:rPr>
-        <w:t xml:space="preserve"> for build management, implementing functions such as model loading, parameter control, basic speech-to-text output, and user interface interaction.</w:t>
+        <w:t>This project employs a combined approach of developmental research and system prototyping, focusing on local offline speech recognition and building a system around mobile learning scenario. Initially, the project planned to combine speech recognition, tone analysis, and visual feedback mechanisms to achieve a more complete pronunciation learning experience. However, during actual development, the focus gradually shifted to the implementation and system integration verification of the offline speech recognition module. The system ultimately uses whisper.cpp as its core speech recognition engine, employs ggml format models for local loading and inference, and utilizes CMake for build management, implementing functions such as model loading, parameter control, basic speech-to-text output, and user interface interaction.</w:t>
       </w:r>
     </w:p>
     <w:p>
@@ -857,9 +806,17 @@
           <w:szCs w:val="22"/>
           <w:lang w:val="en" w:eastAsia="zh-CN"/>
         </w:rPr>
-        <w:t xml:space="preserve"> making the program, the project put more attention on solving normal engineering problems includes the </w:t>
-      </w:r>
-      <w:proofErr w:type="gramStart"/>
+        <w:t xml:space="preserve"> making the program, the project put more attention on solving normal engineering problems includes the std::clamp errors which </w:t>
+      </w:r>
+      <w:r>
+        <w:rPr>
+          <w:rFonts w:ascii="Arial" w:hAnsi="Arial" w:cs="Arial"/>
+          <w:sz w:val="22"/>
+          <w:szCs w:val="22"/>
+          <w:lang w:val="en" w:eastAsia="zh-CN"/>
+        </w:rPr>
+        <w:t>are made</w:t>
+      </w:r>
       <w:r>
         <w:rPr>
           <w:rFonts w:ascii="Arial" w:hAnsi="Arial" w:cs="Arial" w:hint="eastAsia"/>
@@ -867,9 +824,17 @@
           <w:szCs w:val="22"/>
           <w:lang w:val="en" w:eastAsia="zh-CN"/>
         </w:rPr>
-        <w:t>std::</w:t>
-      </w:r>
-      <w:proofErr w:type="gramEnd"/>
+        <w:t xml:space="preserve"> by different encoding </w:t>
+      </w:r>
+      <w:r>
+        <w:rPr>
+          <w:rFonts w:ascii="Arial" w:hAnsi="Arial" w:cs="Arial"/>
+          <w:sz w:val="22"/>
+          <w:szCs w:val="22"/>
+          <w:lang w:val="en" w:eastAsia="zh-CN"/>
+        </w:rPr>
+        <w:t>standards</w:t>
+      </w:r>
       <w:r>
         <w:rPr>
           <w:rFonts w:ascii="Arial" w:hAnsi="Arial" w:cs="Arial" w:hint="eastAsia"/>
@@ -877,7 +842,7 @@
           <w:szCs w:val="22"/>
           <w:lang w:val="en" w:eastAsia="zh-CN"/>
         </w:rPr>
-        <w:t xml:space="preserve">clamp errors which </w:t>
+        <w:t xml:space="preserve"> in Visual Studio, the path error in windows, </w:t>
       </w:r>
       <w:r>
         <w:rPr>
@@ -886,7 +851,7 @@
           <w:szCs w:val="22"/>
           <w:lang w:val="en" w:eastAsia="zh-CN"/>
         </w:rPr>
-        <w:t>are made</w:t>
+        <w:t>GPU backend configuration conflicts and dependency linking issues, etc.</w:t>
       </w:r>
       <w:r>
         <w:rPr>
@@ -895,7 +860,7 @@
           <w:szCs w:val="22"/>
           <w:lang w:val="en" w:eastAsia="zh-CN"/>
         </w:rPr>
-        <w:t xml:space="preserve"> by different encoding </w:t>
+        <w:t xml:space="preserve"> </w:t>
       </w:r>
       <w:r>
         <w:rPr>
@@ -904,8 +869,18 @@
           <w:szCs w:val="22"/>
           <w:lang w:val="en" w:eastAsia="zh-CN"/>
         </w:rPr>
-        <w:t>standards</w:t>
-      </w:r>
+        <w:t>Through continuous debugging and structural adjustments, the system has formed a working prototype that can stably complete phrase-level Chinese speech recognition, verifying the feasibility of the offline speech recognition solution on personal devices.</w:t>
+      </w:r>
+    </w:p>
+    <w:p>
+      <w:pPr>
+        <w:rPr>
+          <w:rFonts w:ascii="Arial" w:hAnsi="Arial" w:cs="Arial"/>
+          <w:sz w:val="22"/>
+          <w:szCs w:val="22"/>
+          <w:lang w:val="en" w:eastAsia="zh-CN"/>
+        </w:rPr>
+      </w:pPr>
       <w:r>
         <w:rPr>
           <w:rFonts w:ascii="Arial" w:hAnsi="Arial" w:cs="Arial" w:hint="eastAsia"/>
@@ -913,16 +888,7 @@
           <w:szCs w:val="22"/>
           <w:lang w:val="en" w:eastAsia="zh-CN"/>
         </w:rPr>
-        <w:t xml:space="preserve"> in Visual Studio, the path error in windows, </w:t>
-      </w:r>
-      <w:r>
-        <w:rPr>
-          <w:rFonts w:ascii="Arial" w:hAnsi="Arial" w:cs="Arial"/>
-          <w:sz w:val="22"/>
-          <w:szCs w:val="22"/>
-          <w:lang w:val="en" w:eastAsia="zh-CN"/>
-        </w:rPr>
-        <w:t>GPU backend configuration conflicts and dependency linking issues, etc.</w:t>
+        <w:t xml:space="preserve">The </w:t>
       </w:r>
       <w:r>
         <w:rPr>
@@ -931,27 +897,8 @@
           <w:szCs w:val="22"/>
           <w:lang w:val="en" w:eastAsia="zh-CN"/>
         </w:rPr>
-        <w:t xml:space="preserve"> </w:t>
-      </w:r>
-      <w:r>
-        <w:rPr>
-          <w:rFonts w:ascii="Arial" w:hAnsi="Arial" w:cs="Arial"/>
-          <w:sz w:val="22"/>
-          <w:szCs w:val="22"/>
-          <w:lang w:val="en" w:eastAsia="zh-CN"/>
-        </w:rPr>
-        <w:t>Through continuous debugging and structural adjustments, the system has formed a working prototype that can stably complete phrase-level Chinese speech recognition, verifying the feasibility of the offline speech recognition solution on personal devices.</w:t>
-      </w:r>
-    </w:p>
-    <w:p>
-      <w:pPr>
-        <w:rPr>
-          <w:rFonts w:ascii="Arial" w:hAnsi="Arial" w:cs="Arial"/>
-          <w:sz w:val="22"/>
-          <w:szCs w:val="22"/>
-          <w:lang w:val="en" w:eastAsia="zh-CN"/>
-        </w:rPr>
-      </w:pPr>
+        <w:t>research result shows the local system plan is more superior on privacy protection, system independent, expansibility than language learning system relying on cloud-based inference</w:t>
+      </w:r>
       <w:r>
         <w:rPr>
           <w:rFonts w:ascii="Arial" w:hAnsi="Arial" w:cs="Arial" w:hint="eastAsia"/>
@@ -959,7 +906,16 @@
           <w:szCs w:val="22"/>
           <w:lang w:val="en" w:eastAsia="zh-CN"/>
         </w:rPr>
-        <w:t xml:space="preserve">The </w:t>
+        <w:t xml:space="preserve">. </w:t>
+      </w:r>
+      <w:r>
+        <w:rPr>
+          <w:rFonts w:ascii="Arial" w:hAnsi="Arial" w:cs="Arial"/>
+          <w:sz w:val="22"/>
+          <w:szCs w:val="22"/>
+          <w:lang w:val="en" w:eastAsia="zh-CN"/>
+        </w:rPr>
+        <w:t>However, the system still needs further improvement in terms of mobile adaptation, detailed pronunciation feedback, scale of user testing, and evaluation of educational effectiveness.</w:t>
       </w:r>
       <w:r>
         <w:rPr>
@@ -968,7 +924,16 @@
           <w:szCs w:val="22"/>
           <w:lang w:val="en" w:eastAsia="zh-CN"/>
         </w:rPr>
-        <w:t>research result shows the local system plan is more superior on privacy protection, system independent, expansibility than language learning system relying on cloud-based inference</w:t>
+        <w:t xml:space="preserve"> </w:t>
+      </w:r>
+      <w:r>
+        <w:rPr>
+          <w:rFonts w:ascii="Arial" w:hAnsi="Arial" w:cs="Arial"/>
+          <w:sz w:val="22"/>
+          <w:szCs w:val="22"/>
+          <w:lang w:val="en" w:eastAsia="zh-CN"/>
+        </w:rPr>
+        <w:t>Overall, this project successfully transformed from conceptual design to a working prototype, laying the technical foundation for subsequent implementation of pronunciation error localization, similarity scoring, and structured feedback mechanisms. It also provides practical reference for the development of lightweight offline AI applications for language learning scenarios.</w:t>
       </w:r>
       <w:r>
         <w:rPr>
@@ -977,42 +942,6 @@
           <w:szCs w:val="22"/>
           <w:lang w:val="en" w:eastAsia="zh-CN"/>
         </w:rPr>
-        <w:t xml:space="preserve">. </w:t>
-      </w:r>
-      <w:r>
-        <w:rPr>
-          <w:rFonts w:ascii="Arial" w:hAnsi="Arial" w:cs="Arial"/>
-          <w:sz w:val="22"/>
-          <w:szCs w:val="22"/>
-          <w:lang w:val="en" w:eastAsia="zh-CN"/>
-        </w:rPr>
-        <w:t>However, the system still needs further improvement in terms of mobile adaptation, detailed pronunciation feedback, scale of user testing, and evaluation of educational effectiveness.</w:t>
-      </w:r>
-      <w:r>
-        <w:rPr>
-          <w:rFonts w:ascii="Arial" w:hAnsi="Arial" w:cs="Arial" w:hint="eastAsia"/>
-          <w:sz w:val="22"/>
-          <w:szCs w:val="22"/>
-          <w:lang w:val="en" w:eastAsia="zh-CN"/>
-        </w:rPr>
-        <w:t xml:space="preserve"> </w:t>
-      </w:r>
-      <w:r>
-        <w:rPr>
-          <w:rFonts w:ascii="Arial" w:hAnsi="Arial" w:cs="Arial"/>
-          <w:sz w:val="22"/>
-          <w:szCs w:val="22"/>
-          <w:lang w:val="en" w:eastAsia="zh-CN"/>
-        </w:rPr>
-        <w:t>Overall, this project successfully transformed from conceptual design to a working prototype, laying the technical foundation for subsequent implementation of pronunciation error localization, similarity scoring, and structured feedback mechanisms. It also provides practical reference for the development of lightweight offline AI applications for language learning scenarios.</w:t>
-      </w:r>
-      <w:r>
-        <w:rPr>
-          <w:rFonts w:ascii="Arial" w:hAnsi="Arial" w:cs="Arial" w:hint="eastAsia"/>
-          <w:sz w:val="22"/>
-          <w:szCs w:val="22"/>
-          <w:lang w:val="en" w:eastAsia="zh-CN"/>
-        </w:rPr>
         <w:t xml:space="preserve"> </w:t>
       </w:r>
     </w:p>
@@ -1417,21 +1346,7 @@
         <w:rPr>
           <w:rFonts w:ascii="Arial" w:hAnsi="Arial" w:cs="Arial"/>
         </w:rPr>
-        <w:t xml:space="preserve">In summary, existing research has provided the theoretical and technical foundation for the direction of "speech recognition + multimodal feedback + mobile learning". However, for Chinese pronunciation learning, especially for beginners, there is still a lack of a systematic solution that truly </w:t>
-      </w:r>
-      <w:proofErr w:type="gramStart"/>
-      <w:r>
-        <w:rPr>
-          <w:rFonts w:ascii="Arial" w:hAnsi="Arial" w:cs="Arial"/>
-        </w:rPr>
-        <w:t>takes into account</w:t>
-      </w:r>
-      <w:proofErr w:type="gramEnd"/>
-      <w:r>
-        <w:rPr>
-          <w:rFonts w:ascii="Arial" w:hAnsi="Arial" w:cs="Arial"/>
-        </w:rPr>
-        <w:t xml:space="preserve"> local operation, real-time feedback, educational interpretability and practical deployment feasibility.</w:t>
+        <w:t>In summary, existing research has provided the theoretical and technical foundation for the direction of "speech recognition + multimodal feedback + mobile learning". However, for Chinese pronunciation learning, especially for beginners, there is still a lack of a systematic solution that truly takes into account local operation, real-time feedback, educational interpretability and practical deployment feasibility.</w:t>
       </w:r>
     </w:p>
     <w:p>

</xml_diff>